<commit_message>
feat: se actualizan los encabezados y tabla de contenido
</commit_message>
<xml_diff>
--- a/Actividad 2 - Documento de formulación del proyecto.docx
+++ b/Actividad 2 - Documento de formulación del proyecto.docx
@@ -9,7 +9,7 @@
           <w:lang w:val="es-ES"/>
         </w:rPr>
       </w:pPr>
-      <w:bookmarkStart w:id="0" w:name="_Toc225965955"/>
+      <w:bookmarkStart w:id="0" w:name="_Toc226298125"/>
       <w:r>
         <w:rPr>
           <w:lang w:val="es-ES"/>
@@ -380,7 +380,6 @@
           <w:docPartUnique/>
         </w:docPartObj>
       </w:sdtPr>
-      <w:sdtEndPr/>
       <w:sdtContent>
         <w:p>
           <w:pPr>
@@ -417,7 +416,7 @@
           <w:r>
             <w:fldChar w:fldCharType="separate"/>
           </w:r>
-          <w:hyperlink w:anchor="_Toc225965955" w:history="1">
+          <w:hyperlink w:anchor="_Toc226298125" w:history="1">
             <w:r>
               <w:rPr>
                 <w:rStyle w:val="Hipervnculo"/>
@@ -445,7 +444,7 @@
                 <w:noProof/>
                 <w:webHidden/>
               </w:rPr>
-              <w:instrText xml:space="preserve"> PAGEREF _Toc225965955 \h </w:instrText>
+              <w:instrText xml:space="preserve"> PAGEREF _Toc226298125 \h </w:instrText>
             </w:r>
             <w:r>
               <w:rPr>
@@ -488,7 +487,7 @@
               <w:lang w:eastAsia="es-CO"/>
             </w:rPr>
           </w:pPr>
-          <w:hyperlink w:anchor="_Toc225965956" w:history="1">
+          <w:hyperlink w:anchor="_Toc226298126" w:history="1">
             <w:r>
               <w:rPr>
                 <w:rStyle w:val="Hipervnculo"/>
@@ -517,7 +516,7 @@
                 <w:noProof/>
                 <w:webHidden/>
               </w:rPr>
-              <w:instrText xml:space="preserve"> PAGEREF _Toc225965956 \h </w:instrText>
+              <w:instrText xml:space="preserve"> PAGEREF _Toc226298126 \h </w:instrText>
             </w:r>
             <w:r>
               <w:rPr>
@@ -560,7 +559,7 @@
               <w:lang w:eastAsia="es-CO"/>
             </w:rPr>
           </w:pPr>
-          <w:hyperlink w:anchor="_Toc225965957" w:history="1">
+          <w:hyperlink w:anchor="_Toc226298127" w:history="1">
             <w:r>
               <w:rPr>
                 <w:rStyle w:val="Hipervnculo"/>
@@ -568,7 +567,7 @@
                 <w:noProof/>
                 <w:lang w:val="es-ES"/>
               </w:rPr>
-              <w:t>Necesidad y Problema del Proyecto – Marly</w:t>
+              <w:t>Necesidad y Problema del Proyecto</w:t>
             </w:r>
             <w:r>
               <w:rPr>
@@ -589,7 +588,7 @@
                 <w:noProof/>
                 <w:webHidden/>
               </w:rPr>
-              <w:instrText xml:space="preserve"> PAGEREF _Toc225965957 \h </w:instrText>
+              <w:instrText xml:space="preserve"> PAGEREF _Toc226298127 \h </w:instrText>
             </w:r>
             <w:r>
               <w:rPr>
@@ -632,7 +631,7 @@
               <w:lang w:eastAsia="es-CO"/>
             </w:rPr>
           </w:pPr>
-          <w:hyperlink w:anchor="_Toc225965958" w:history="1">
+          <w:hyperlink w:anchor="_Toc226298128" w:history="1">
             <w:r>
               <w:rPr>
                 <w:rStyle w:val="Hipervnculo"/>
@@ -660,7 +659,7 @@
                 <w:noProof/>
                 <w:webHidden/>
               </w:rPr>
-              <w:instrText xml:space="preserve"> PAGEREF _Toc225965958 \h </w:instrText>
+              <w:instrText xml:space="preserve"> PAGEREF _Toc226298128 \h </w:instrText>
             </w:r>
             <w:r>
               <w:rPr>
@@ -703,7 +702,7 @@
               <w:lang w:eastAsia="es-CO"/>
             </w:rPr>
           </w:pPr>
-          <w:hyperlink w:anchor="_Toc225965959" w:history="1">
+          <w:hyperlink w:anchor="_Toc226298129" w:history="1">
             <w:r>
               <w:rPr>
                 <w:rStyle w:val="Hipervnculo"/>
@@ -731,7 +730,7 @@
                 <w:noProof/>
                 <w:webHidden/>
               </w:rPr>
-              <w:instrText xml:space="preserve"> PAGEREF _Toc225965959 \h </w:instrText>
+              <w:instrText xml:space="preserve"> PAGEREF _Toc226298129 \h </w:instrText>
             </w:r>
             <w:r>
               <w:rPr>
@@ -774,7 +773,7 @@
               <w:lang w:eastAsia="es-CO"/>
             </w:rPr>
           </w:pPr>
-          <w:hyperlink w:anchor="_Toc225965960" w:history="1">
+          <w:hyperlink w:anchor="_Toc226298130" w:history="1">
             <w:r>
               <w:rPr>
                 <w:rStyle w:val="Hipervnculo"/>
@@ -802,7 +801,7 @@
                 <w:noProof/>
                 <w:webHidden/>
               </w:rPr>
-              <w:instrText xml:space="preserve"> PAGEREF _Toc225965960 \h </w:instrText>
+              <w:instrText xml:space="preserve"> PAGEREF _Toc226298130 \h </w:instrText>
             </w:r>
             <w:r>
               <w:rPr>
@@ -845,7 +844,7 @@
               <w:lang w:eastAsia="es-CO"/>
             </w:rPr>
           </w:pPr>
-          <w:hyperlink w:anchor="_Toc225965961" w:history="1">
+          <w:hyperlink w:anchor="_Toc226298131" w:history="1">
             <w:r>
               <w:rPr>
                 <w:rStyle w:val="Hipervnculo"/>
@@ -873,7 +872,7 @@
                 <w:noProof/>
                 <w:webHidden/>
               </w:rPr>
-              <w:instrText xml:space="preserve"> PAGEREF _Toc225965961 \h </w:instrText>
+              <w:instrText xml:space="preserve"> PAGEREF _Toc226298131 \h </w:instrText>
             </w:r>
             <w:r>
               <w:rPr>
@@ -916,7 +915,7 @@
               <w:lang w:eastAsia="es-CO"/>
             </w:rPr>
           </w:pPr>
-          <w:hyperlink w:anchor="_Toc225965962" w:history="1">
+          <w:hyperlink w:anchor="_Toc226298132" w:history="1">
             <w:r>
               <w:rPr>
                 <w:rStyle w:val="Hipervnculo"/>
@@ -945,7 +944,7 @@
                 <w:noProof/>
                 <w:webHidden/>
               </w:rPr>
-              <w:instrText xml:space="preserve"> PAGEREF _Toc225965962 \h </w:instrText>
+              <w:instrText xml:space="preserve"> PAGEREF _Toc226298132 \h </w:instrText>
             </w:r>
             <w:r>
               <w:rPr>
@@ -988,7 +987,7 @@
               <w:lang w:eastAsia="es-CO"/>
             </w:rPr>
           </w:pPr>
-          <w:hyperlink w:anchor="_Toc225965963" w:history="1">
+          <w:hyperlink w:anchor="_Toc226298133" w:history="1">
             <w:r>
               <w:rPr>
                 <w:rStyle w:val="Hipervnculo"/>
@@ -1017,7 +1016,7 @@
                 <w:noProof/>
                 <w:webHidden/>
               </w:rPr>
-              <w:instrText xml:space="preserve"> PAGEREF _Toc225965963 \h </w:instrText>
+              <w:instrText xml:space="preserve"> PAGEREF _Toc226298133 \h </w:instrText>
             </w:r>
             <w:r>
               <w:rPr>
@@ -1060,7 +1059,7 @@
               <w:lang w:eastAsia="es-CO"/>
             </w:rPr>
           </w:pPr>
-          <w:hyperlink w:anchor="_Toc225965964" w:history="1">
+          <w:hyperlink w:anchor="_Toc226298134" w:history="1">
             <w:r>
               <w:rPr>
                 <w:rStyle w:val="Hipervnculo"/>
@@ -1089,7 +1088,7 @@
                 <w:noProof/>
                 <w:webHidden/>
               </w:rPr>
-              <w:instrText xml:space="preserve"> PAGEREF _Toc225965964 \h </w:instrText>
+              <w:instrText xml:space="preserve"> PAGEREF _Toc226298134 \h </w:instrText>
             </w:r>
             <w:r>
               <w:rPr>
@@ -1132,7 +1131,7 @@
               <w:lang w:eastAsia="es-CO"/>
             </w:rPr>
           </w:pPr>
-          <w:hyperlink w:anchor="_Toc225965965" w:history="1">
+          <w:hyperlink w:anchor="_Toc226298135" w:history="1">
             <w:r>
               <w:rPr>
                 <w:rStyle w:val="Hipervnculo"/>
@@ -1161,7 +1160,7 @@
                 <w:noProof/>
                 <w:webHidden/>
               </w:rPr>
-              <w:instrText xml:space="preserve"> PAGEREF _Toc225965965 \h </w:instrText>
+              <w:instrText xml:space="preserve"> PAGEREF _Toc226298135 \h </w:instrText>
             </w:r>
             <w:r>
               <w:rPr>
@@ -1204,7 +1203,7 @@
               <w:lang w:eastAsia="es-CO"/>
             </w:rPr>
           </w:pPr>
-          <w:hyperlink w:anchor="_Toc225965966" w:history="1">
+          <w:hyperlink w:anchor="_Toc226298136" w:history="1">
             <w:r>
               <w:rPr>
                 <w:rStyle w:val="Hipervnculo"/>
@@ -1233,7 +1232,7 @@
                 <w:noProof/>
                 <w:webHidden/>
               </w:rPr>
-              <w:instrText xml:space="preserve"> PAGEREF _Toc225965966 \h </w:instrText>
+              <w:instrText xml:space="preserve"> PAGEREF _Toc226298136 \h </w:instrText>
             </w:r>
             <w:r>
               <w:rPr>
@@ -1276,7 +1275,7 @@
               <w:lang w:eastAsia="es-CO"/>
             </w:rPr>
           </w:pPr>
-          <w:hyperlink w:anchor="_Toc225965967" w:history="1">
+          <w:hyperlink w:anchor="_Toc226298137" w:history="1">
             <w:r>
               <w:rPr>
                 <w:rStyle w:val="Hipervnculo"/>
@@ -1305,7 +1304,7 @@
                 <w:noProof/>
                 <w:webHidden/>
               </w:rPr>
-              <w:instrText xml:space="preserve"> PAGEREF _Toc225965967 \h </w:instrText>
+              <w:instrText xml:space="preserve"> PAGEREF _Toc226298137 \h </w:instrText>
             </w:r>
             <w:r>
               <w:rPr>
@@ -1348,7 +1347,7 @@
               <w:lang w:eastAsia="es-CO"/>
             </w:rPr>
           </w:pPr>
-          <w:hyperlink w:anchor="_Toc225965968" w:history="1">
+          <w:hyperlink w:anchor="_Toc226298138" w:history="1">
             <w:r>
               <w:rPr>
                 <w:rStyle w:val="Hipervnculo"/>
@@ -1377,7 +1376,7 @@
                 <w:noProof/>
                 <w:webHidden/>
               </w:rPr>
-              <w:instrText xml:space="preserve"> PAGEREF _Toc225965968 \h </w:instrText>
+              <w:instrText xml:space="preserve"> PAGEREF _Toc226298138 \h </w:instrText>
             </w:r>
             <w:r>
               <w:rPr>
@@ -1420,7 +1419,7 @@
               <w:lang w:eastAsia="es-CO"/>
             </w:rPr>
           </w:pPr>
-          <w:hyperlink w:anchor="_Toc225965969" w:history="1">
+          <w:hyperlink w:anchor="_Toc226298139" w:history="1">
             <w:r>
               <w:rPr>
                 <w:rStyle w:val="Hipervnculo"/>
@@ -1449,7 +1448,7 @@
                 <w:noProof/>
                 <w:webHidden/>
               </w:rPr>
-              <w:instrText xml:space="preserve"> PAGEREF _Toc225965969 \h </w:instrText>
+              <w:instrText xml:space="preserve"> PAGEREF _Toc226298139 \h </w:instrText>
             </w:r>
             <w:r>
               <w:rPr>
@@ -1492,7 +1491,7 @@
               <w:lang w:eastAsia="es-CO"/>
             </w:rPr>
           </w:pPr>
-          <w:hyperlink w:anchor="_Toc225965970" w:history="1">
+          <w:hyperlink w:anchor="_Toc226298140" w:history="1">
             <w:r>
               <w:rPr>
                 <w:rStyle w:val="Hipervnculo"/>
@@ -1521,7 +1520,7 @@
                 <w:noProof/>
                 <w:webHidden/>
               </w:rPr>
-              <w:instrText xml:space="preserve"> PAGEREF _Toc225965970 \h </w:instrText>
+              <w:instrText xml:space="preserve"> PAGEREF _Toc226298140 \h </w:instrText>
             </w:r>
             <w:r>
               <w:rPr>
@@ -1564,7 +1563,7 @@
               <w:lang w:eastAsia="es-CO"/>
             </w:rPr>
           </w:pPr>
-          <w:hyperlink w:anchor="_Toc225965971" w:history="1">
+          <w:hyperlink w:anchor="_Toc226298141" w:history="1">
             <w:r>
               <w:rPr>
                 <w:rStyle w:val="Hipervnculo"/>
@@ -1593,7 +1592,7 @@
                 <w:noProof/>
                 <w:webHidden/>
               </w:rPr>
-              <w:instrText xml:space="preserve"> PAGEREF _Toc225965971 \h </w:instrText>
+              <w:instrText xml:space="preserve"> PAGEREF _Toc226298141 \h </w:instrText>
             </w:r>
             <w:r>
               <w:rPr>
@@ -1636,7 +1635,7 @@
               <w:lang w:eastAsia="es-CO"/>
             </w:rPr>
           </w:pPr>
-          <w:hyperlink w:anchor="_Toc225965972" w:history="1">
+          <w:hyperlink w:anchor="_Toc226298142" w:history="1">
             <w:r>
               <w:rPr>
                 <w:rStyle w:val="Hipervnculo"/>
@@ -1665,7 +1664,7 @@
                 <w:noProof/>
                 <w:webHidden/>
               </w:rPr>
-              <w:instrText xml:space="preserve"> PAGEREF _Toc225965972 \h </w:instrText>
+              <w:instrText xml:space="preserve"> PAGEREF _Toc226298142 \h </w:instrText>
             </w:r>
             <w:r>
               <w:rPr>
@@ -1708,7 +1707,7 @@
               <w:lang w:eastAsia="es-CO"/>
             </w:rPr>
           </w:pPr>
-          <w:hyperlink w:anchor="_Toc225965973" w:history="1">
+          <w:hyperlink w:anchor="_Toc226298143" w:history="1">
             <w:r>
               <w:rPr>
                 <w:rStyle w:val="Hipervnculo"/>
@@ -1736,7 +1735,7 @@
                 <w:noProof/>
                 <w:webHidden/>
               </w:rPr>
-              <w:instrText xml:space="preserve"> PAGEREF _Toc225965973 \h </w:instrText>
+              <w:instrText xml:space="preserve"> PAGEREF _Toc226298143 \h </w:instrText>
             </w:r>
             <w:r>
               <w:rPr>
@@ -1779,7 +1778,7 @@
               <w:lang w:eastAsia="es-CO"/>
             </w:rPr>
           </w:pPr>
-          <w:hyperlink w:anchor="_Toc225965974" w:history="1">
+          <w:hyperlink w:anchor="_Toc226298144" w:history="1">
             <w:r>
               <w:rPr>
                 <w:rStyle w:val="Hipervnculo"/>
@@ -1807,7 +1806,7 @@
                 <w:noProof/>
                 <w:webHidden/>
               </w:rPr>
-              <w:instrText xml:space="preserve"> PAGEREF _Toc225965974 \h </w:instrText>
+              <w:instrText xml:space="preserve"> PAGEREF _Toc226298144 \h </w:instrText>
             </w:r>
             <w:r>
               <w:rPr>
@@ -1850,7 +1849,7 @@
               <w:lang w:eastAsia="es-CO"/>
             </w:rPr>
           </w:pPr>
-          <w:hyperlink w:anchor="_Toc225965975" w:history="1">
+          <w:hyperlink w:anchor="_Toc226298145" w:history="1">
             <w:r>
               <w:rPr>
                 <w:rStyle w:val="Hipervnculo"/>
@@ -1878,7 +1877,7 @@
                 <w:noProof/>
                 <w:webHidden/>
               </w:rPr>
-              <w:instrText xml:space="preserve"> PAGEREF _Toc225965975 \h </w:instrText>
+              <w:instrText xml:space="preserve"> PAGEREF _Toc226298145 \h </w:instrText>
             </w:r>
             <w:r>
               <w:rPr>
@@ -1921,7 +1920,7 @@
               <w:lang w:eastAsia="es-CO"/>
             </w:rPr>
           </w:pPr>
-          <w:hyperlink w:anchor="_Toc225965976" w:history="1">
+          <w:hyperlink w:anchor="_Toc226298146" w:history="1">
             <w:r>
               <w:rPr>
                 <w:rStyle w:val="Hipervnculo"/>
@@ -1951,7 +1950,7 @@
                 <w:noProof/>
                 <w:webHidden/>
               </w:rPr>
-              <w:instrText xml:space="preserve"> PAGEREF _Toc225965976 \h </w:instrText>
+              <w:instrText xml:space="preserve"> PAGEREF _Toc226298146 \h </w:instrText>
             </w:r>
             <w:r>
               <w:rPr>
@@ -1994,7 +1993,7 @@
               <w:lang w:eastAsia="es-CO"/>
             </w:rPr>
           </w:pPr>
-          <w:hyperlink w:anchor="_Toc225965977" w:history="1">
+          <w:hyperlink w:anchor="_Toc226298147" w:history="1">
             <w:r>
               <w:rPr>
                 <w:rStyle w:val="Hipervnculo"/>
@@ -2024,7 +2023,7 @@
                 <w:noProof/>
                 <w:webHidden/>
               </w:rPr>
-              <w:instrText xml:space="preserve"> PAGEREF _Toc225965977 \h </w:instrText>
+              <w:instrText xml:space="preserve"> PAGEREF _Toc226298147 \h </w:instrText>
             </w:r>
             <w:r>
               <w:rPr>
@@ -2067,7 +2066,7 @@
               <w:lang w:eastAsia="es-CO"/>
             </w:rPr>
           </w:pPr>
-          <w:hyperlink w:anchor="_Toc225965978" w:history="1">
+          <w:hyperlink w:anchor="_Toc226298148" w:history="1">
             <w:r>
               <w:rPr>
                 <w:rStyle w:val="Hipervnculo"/>
@@ -2097,7 +2096,7 @@
                 <w:noProof/>
                 <w:webHidden/>
               </w:rPr>
-              <w:instrText xml:space="preserve"> PAGEREF _Toc225965978 \h </w:instrText>
+              <w:instrText xml:space="preserve"> PAGEREF _Toc226298148 \h </w:instrText>
             </w:r>
             <w:r>
               <w:rPr>
@@ -2140,7 +2139,7 @@
               <w:lang w:eastAsia="es-CO"/>
             </w:rPr>
           </w:pPr>
-          <w:hyperlink w:anchor="_Toc225965979" w:history="1">
+          <w:hyperlink w:anchor="_Toc226298149" w:history="1">
             <w:r>
               <w:rPr>
                 <w:rStyle w:val="Hipervnculo"/>
@@ -2168,7 +2167,7 @@
                 <w:noProof/>
                 <w:webHidden/>
               </w:rPr>
-              <w:instrText xml:space="preserve"> PAGEREF _Toc225965979 \h </w:instrText>
+              <w:instrText xml:space="preserve"> PAGEREF _Toc226298149 \h </w:instrText>
             </w:r>
             <w:r>
               <w:rPr>
@@ -2211,14 +2210,14 @@
               <w:lang w:eastAsia="es-CO"/>
             </w:rPr>
           </w:pPr>
-          <w:hyperlink w:anchor="_Toc225965980" w:history="1">
+          <w:hyperlink w:anchor="_Toc226298150" w:history="1">
             <w:r>
               <w:rPr>
                 <w:rStyle w:val="Hipervnculo"/>
                 <w:noProof/>
-                <w:lang w:val="es-ES"/>
-              </w:rPr>
-              <w:t>Referencias Bibliográficas – Todos</w:t>
+                <w:lang w:val="en-US"/>
+              </w:rPr>
+              <w:t>Referencias Bibliográficas</w:t>
             </w:r>
             <w:r>
               <w:rPr>
@@ -2239,7 +2238,7 @@
                 <w:noProof/>
                 <w:webHidden/>
               </w:rPr>
-              <w:instrText xml:space="preserve"> PAGEREF _Toc225965980 \h </w:instrText>
+              <w:instrText xml:space="preserve"> PAGEREF _Toc226298150 \h </w:instrText>
             </w:r>
             <w:r>
               <w:rPr>
@@ -2316,7 +2315,7 @@
           <w:lang w:val="es"/>
         </w:rPr>
       </w:pPr>
-      <w:bookmarkStart w:id="1" w:name="_Toc225965956"/>
+      <w:bookmarkStart w:id="1" w:name="_Toc226298126"/>
       <w:r>
         <w:rPr>
           <w:rFonts w:eastAsia="Times New Roman" w:cs="Times New Roman"/>
@@ -2451,14 +2450,14 @@
           <w:lang w:val="es-ES"/>
         </w:rPr>
       </w:pPr>
-      <w:bookmarkStart w:id="2" w:name="_Toc225965957"/>
+      <w:bookmarkStart w:id="2" w:name="_Toc226298127"/>
       <w:r>
         <w:rPr>
           <w:rFonts w:cs="Times New Roman"/>
           <w:lang w:val="es-ES"/>
         </w:rPr>
         <w:lastRenderedPageBreak/>
-        <w:t>Necesidad y Problema del Proyecto – Marly</w:t>
+        <w:t>Necesidad y Problema del Proyecto</w:t>
       </w:r>
       <w:bookmarkEnd w:id="2"/>
     </w:p>
@@ -2659,7 +2658,7 @@
           <w:lang w:val="es-ES"/>
         </w:rPr>
       </w:pPr>
-      <w:bookmarkStart w:id="3" w:name="_Toc225965958"/>
+      <w:bookmarkStart w:id="3" w:name="_Toc226298128"/>
       <w:r>
         <w:rPr>
           <w:lang w:val="es-ES"/>
@@ -2880,7 +2879,7 @@
           <w:lang w:val="es-ES"/>
         </w:rPr>
       </w:pPr>
-      <w:bookmarkStart w:id="4" w:name="_Toc225965959"/>
+      <w:bookmarkStart w:id="4" w:name="_Toc226298129"/>
       <w:r>
         <w:rPr>
           <w:lang w:val="es-ES"/>
@@ -3187,7 +3186,7 @@
           <w:lang w:val="es-ES"/>
         </w:rPr>
       </w:pPr>
-      <w:bookmarkStart w:id="5" w:name="_Toc225965960"/>
+      <w:bookmarkStart w:id="5" w:name="_Toc226298130"/>
       <w:r>
         <w:rPr>
           <w:lang w:val="es-ES"/>
@@ -3339,7 +3338,7 @@
           <w:lang w:val="es-ES"/>
         </w:rPr>
       </w:pPr>
-      <w:bookmarkStart w:id="6" w:name="_Toc225965961"/>
+      <w:bookmarkStart w:id="6" w:name="_Toc226298131"/>
       <w:r>
         <w:rPr>
           <w:lang w:val="es-ES"/>
@@ -7318,7 +7317,7 @@
           <w:lang w:val="es"/>
         </w:rPr>
       </w:pPr>
-      <w:bookmarkStart w:id="7" w:name="_Toc225965962"/>
+      <w:bookmarkStart w:id="7" w:name="_Toc226298132"/>
       <w:r>
         <w:rPr>
           <w:rFonts w:eastAsia="Times New Roman" w:cs="Times New Roman"/>
@@ -7361,7 +7360,7 @@
           <w:lang w:val="es-ES"/>
         </w:rPr>
       </w:pPr>
-      <w:bookmarkStart w:id="8" w:name="_Toc225965963"/>
+      <w:bookmarkStart w:id="8" w:name="_Toc226298133"/>
       <w:r>
         <w:rPr>
           <w:rFonts w:eastAsia="Times New Roman" w:cs="Times New Roman"/>
@@ -7603,7 +7602,7 @@
           <w:lang w:val="es-ES"/>
         </w:rPr>
       </w:pPr>
-      <w:bookmarkStart w:id="9" w:name="_Toc225965964"/>
+      <w:bookmarkStart w:id="9" w:name="_Toc226298134"/>
       <w:r>
         <w:rPr>
           <w:rFonts w:eastAsia="Times New Roman" w:cs="Times New Roman"/>
@@ -7774,7 +7773,7 @@
           <w:lang w:val="es"/>
         </w:rPr>
       </w:pPr>
-      <w:bookmarkStart w:id="10" w:name="_Toc225965965"/>
+      <w:bookmarkStart w:id="10" w:name="_Toc226298135"/>
       <w:r>
         <w:rPr>
           <w:rFonts w:eastAsia="Times New Roman" w:cs="Times New Roman"/>
@@ -7809,7 +7808,7 @@
           <w:lang w:val="es-ES"/>
         </w:rPr>
       </w:pPr>
-      <w:bookmarkStart w:id="11" w:name="_Toc225965966"/>
+      <w:bookmarkStart w:id="11" w:name="_Toc226298136"/>
       <w:r>
         <w:rPr>
           <w:rFonts w:eastAsia="Times New Roman" w:cs="Times New Roman"/>
@@ -8145,7 +8144,7 @@
           <w:lang w:val="es-ES"/>
         </w:rPr>
       </w:pPr>
-      <w:bookmarkStart w:id="12" w:name="_Toc225965967"/>
+      <w:bookmarkStart w:id="12" w:name="_Toc226298137"/>
       <w:r>
         <w:rPr>
           <w:rFonts w:eastAsia="Times New Roman" w:cs="Times New Roman"/>
@@ -8524,7 +8523,7 @@
           <w:lang w:val="es-ES"/>
         </w:rPr>
       </w:pPr>
-      <w:bookmarkStart w:id="13" w:name="_Toc225965968"/>
+      <w:bookmarkStart w:id="13" w:name="_Toc226298138"/>
       <w:r>
         <w:rPr>
           <w:rFonts w:eastAsia="Times New Roman" w:cs="Times New Roman"/>
@@ -8924,7 +8923,7 @@
           <w:lang w:val="es-ES"/>
         </w:rPr>
       </w:pPr>
-      <w:bookmarkStart w:id="14" w:name="_Toc225965969"/>
+      <w:bookmarkStart w:id="14" w:name="_Toc226298139"/>
       <w:r>
         <w:rPr>
           <w:rFonts w:eastAsia="Times New Roman" w:cs="Times New Roman"/>
@@ -9309,7 +9308,7 @@
           <w:lang w:val="es-ES"/>
         </w:rPr>
       </w:pPr>
-      <w:bookmarkStart w:id="15" w:name="_Toc225965970"/>
+      <w:bookmarkStart w:id="15" w:name="_Toc226298140"/>
       <w:r>
         <w:rPr>
           <w:rFonts w:eastAsia="Times New Roman" w:cs="Times New Roman"/>
@@ -9688,7 +9687,7 @@
           <w:lang w:val="es-ES"/>
         </w:rPr>
       </w:pPr>
-      <w:bookmarkStart w:id="16" w:name="_Toc225965971"/>
+      <w:bookmarkStart w:id="16" w:name="_Toc226298141"/>
       <w:r>
         <w:rPr>
           <w:rFonts w:eastAsia="Times New Roman" w:cs="Times New Roman"/>
@@ -10090,7 +10089,7 @@
           <w:lang w:val="es-ES"/>
         </w:rPr>
       </w:pPr>
-      <w:bookmarkStart w:id="17" w:name="_Toc225965972"/>
+      <w:bookmarkStart w:id="17" w:name="_Toc226298142"/>
       <w:r>
         <w:rPr>
           <w:rFonts w:eastAsia="Times New Roman" w:cs="Times New Roman"/>
@@ -10462,7 +10461,7 @@
           <w:lang w:val="es-ES"/>
         </w:rPr>
       </w:pPr>
-      <w:bookmarkStart w:id="18" w:name="_Toc225965973"/>
+      <w:bookmarkStart w:id="18" w:name="_Toc226298143"/>
       <w:r>
         <w:rPr>
           <w:lang w:val="es-ES"/>
@@ -10616,7 +10615,7 @@
           <w:lang w:val="es-ES"/>
         </w:rPr>
       </w:pPr>
-      <w:bookmarkStart w:id="19" w:name="_Toc225965974"/>
+      <w:bookmarkStart w:id="19" w:name="_Toc226298144"/>
       <w:r>
         <w:rPr>
           <w:lang w:val="es-ES"/>
@@ -11561,7 +11560,7 @@
           <w:lang w:val="es-ES"/>
         </w:rPr>
       </w:pPr>
-      <w:bookmarkStart w:id="20" w:name="_Toc225965975"/>
+      <w:bookmarkStart w:id="20" w:name="_Toc226298145"/>
       <w:r>
         <w:rPr>
           <w:lang w:val="es-ES"/>
@@ -11588,7 +11587,7 @@
           <w:lang w:val="es-ES"/>
         </w:rPr>
       </w:pPr>
-      <w:bookmarkStart w:id="21" w:name="_Toc225965976"/>
+      <w:bookmarkStart w:id="21" w:name="_Toc226298146"/>
       <w:r>
         <w:rPr>
           <w:rFonts w:eastAsia="Times New Roman" w:cs="Times New Roman"/>
@@ -11734,7 +11733,7 @@
           <w:lang w:val="es-ES"/>
         </w:rPr>
       </w:pPr>
-      <w:bookmarkStart w:id="22" w:name="_Toc225965977"/>
+      <w:bookmarkStart w:id="22" w:name="_Toc226298147"/>
       <w:r>
         <w:rPr>
           <w:rFonts w:eastAsia="Times New Roman" w:cs="Times New Roman"/>
@@ -11785,7 +11784,7 @@
           <w:lang w:val="es-ES"/>
         </w:rPr>
       </w:pPr>
-      <w:bookmarkStart w:id="23" w:name="_Toc225965978"/>
+      <w:bookmarkStart w:id="23" w:name="_Toc226298148"/>
       <w:r>
         <w:rPr>
           <w:rFonts w:eastAsia="Times New Roman" w:cs="Times New Roman"/>
@@ -11902,7 +11901,7 @@
           <w:lang w:val="es-ES"/>
         </w:rPr>
       </w:pPr>
-      <w:bookmarkStart w:id="24" w:name="_Toc225965979"/>
+      <w:bookmarkStart w:id="24" w:name="_Toc226298149"/>
       <w:r>
         <w:rPr>
           <w:lang w:val="es-ES"/>
@@ -11987,30 +11986,34 @@
       <w:pPr>
         <w:pStyle w:val="Ttulo2"/>
         <w:rPr>
-          <w:lang w:val="es-ES"/>
-        </w:rPr>
-      </w:pPr>
-      <w:bookmarkStart w:id="25" w:name="_Toc225965980"/>
-      <w:r>
-        <w:rPr>
-          <w:lang w:val="es-ES"/>
+          <w:lang w:val="en-US"/>
+        </w:rPr>
+      </w:pPr>
+      <w:bookmarkStart w:id="25" w:name="_Toc226298150"/>
+      <w:proofErr w:type="spellStart"/>
+      <w:r>
+        <w:rPr>
+          <w:lang w:val="en-US"/>
         </w:rPr>
         <w:lastRenderedPageBreak/>
-        <w:t xml:space="preserve">Referencias Bibliográficas </w:t>
-      </w:r>
-      <w:r>
-        <w:rPr>
-          <w:lang w:val="es-ES"/>
-        </w:rPr>
-        <w:t>–</w:t>
-      </w:r>
-      <w:r>
-        <w:rPr>
-          <w:lang w:val="es-ES"/>
-        </w:rPr>
-        <w:t xml:space="preserve"> Todos</w:t>
+        <w:t>Referencias</w:t>
+      </w:r>
+      <w:proofErr w:type="spellEnd"/>
+      <w:r>
+        <w:rPr>
+          <w:lang w:val="en-US"/>
+        </w:rPr>
+        <w:t xml:space="preserve"> </w:t>
+      </w:r>
+      <w:proofErr w:type="spellStart"/>
+      <w:r>
+        <w:rPr>
+          <w:lang w:val="en-US"/>
+        </w:rPr>
+        <w:t>Bibliográficas</w:t>
       </w:r>
       <w:bookmarkEnd w:id="25"/>
+      <w:proofErr w:type="spellEnd"/>
     </w:p>
     <w:p>
       <w:pPr>
@@ -12345,7 +12348,6 @@
         <w:docPartUnique/>
       </w:docPartObj>
     </w:sdtPr>
-    <w:sdtEndPr/>
     <w:sdtContent>
       <w:p>
         <w:pPr>
@@ -15066,6 +15068,19 @@
 </file>
 
 <file path=customXml/item1.xml><?xml version="1.0" encoding="utf-8"?>
+<b:Sources xmlns:b="http://schemas.openxmlformats.org/officeDocument/2006/bibliography" xmlns="http://schemas.openxmlformats.org/officeDocument/2006/bibliography" SelectedStyle="\APASixthEditionOfficeOnline.xsl" StyleName="APA" Version="6"/>
+</file>
+
+<file path=customXml/item2.xml><?xml version="1.0" encoding="utf-8"?>
+<?mso-contentType ?>
+<FormTemplates xmlns="http://schemas.microsoft.com/sharepoint/v3/contenttype/forms">
+  <Display>DocumentLibraryForm</Display>
+  <Edit>DocumentLibraryForm</Edit>
+  <New>DocumentLibraryForm</New>
+</FormTemplates>
+</file>
+
+<file path=customXml/item3.xml><?xml version="1.0" encoding="utf-8"?>
 <ct:contentTypeSchema xmlns:ct="http://schemas.microsoft.com/office/2006/metadata/contentType" xmlns:ma="http://schemas.microsoft.com/office/2006/metadata/properties/metaAttributes" ct:_="" ma:_="" ma:contentTypeName="Documento" ma:contentTypeID="0x01010096645DAEA9EA6B4BB1950E56B12A2403" ma:contentTypeVersion="10" ma:contentTypeDescription="Crear nuevo documento." ma:contentTypeScope="" ma:versionID="92aa177cd9e44bcf2577cb2b54f54900">
   <xsd:schema xmlns:xsd="http://www.w3.org/2001/XMLSchema" xmlns:xs="http://www.w3.org/2001/XMLSchema" xmlns:p="http://schemas.microsoft.com/office/2006/metadata/properties" xmlns:ns3="681aa3a0-d865-44f3-85fa-6d2a2aaaf72a" targetNamespace="http://schemas.microsoft.com/office/2006/metadata/properties" ma:root="true" ma:fieldsID="2f7529d8d82a95aca2c9d7781acfde8e" ns3:_="">
     <xsd:import namespace="681aa3a0-d865-44f3-85fa-6d2a2aaaf72a"/>
@@ -15245,19 +15260,6 @@
 </ct:contentTypeSchema>
 </file>
 
-<file path=customXml/item2.xml><?xml version="1.0" encoding="utf-8"?>
-<?mso-contentType ?>
-<FormTemplates xmlns="http://schemas.microsoft.com/sharepoint/v3/contenttype/forms">
-  <Display>DocumentLibraryForm</Display>
-  <Edit>DocumentLibraryForm</Edit>
-  <New>DocumentLibraryForm</New>
-</FormTemplates>
-</file>
-
-<file path=customXml/item3.xml><?xml version="1.0" encoding="utf-8"?>
-<b:Sources xmlns:b="http://schemas.openxmlformats.org/officeDocument/2006/bibliography" xmlns="http://schemas.openxmlformats.org/officeDocument/2006/bibliography" SelectedStyle="\APASixthEditionOfficeOnline.xsl" StyleName="APA" Version="6"/>
-</file>
-
 <file path=customXml/item4.xml><?xml version="1.0" encoding="utf-8"?>
 <p:properties xmlns:p="http://schemas.microsoft.com/office/2006/metadata/properties" xmlns:xsi="http://www.w3.org/2001/XMLSchema-instance" xmlns:pc="http://schemas.microsoft.com/office/infopath/2007/PartnerControls">
   <documentManagement>
@@ -15267,6 +15269,22 @@
 </file>
 
 <file path=customXml/itemProps1.xml><?xml version="1.0" encoding="utf-8"?>
+<ds:datastoreItem xmlns:ds="http://schemas.openxmlformats.org/officeDocument/2006/customXml" ds:itemID="{89723AB6-AEB7-4B91-A3E6-C82E45933B72}">
+  <ds:schemaRefs>
+    <ds:schemaRef ds:uri="http://schemas.openxmlformats.org/officeDocument/2006/bibliography"/>
+  </ds:schemaRefs>
+</ds:datastoreItem>
+</file>
+
+<file path=customXml/itemProps2.xml><?xml version="1.0" encoding="utf-8"?>
+<ds:datastoreItem xmlns:ds="http://schemas.openxmlformats.org/officeDocument/2006/customXml" ds:itemID="{C2475F33-3476-4294-A854-866A38AE37AD}">
+  <ds:schemaRefs>
+    <ds:schemaRef ds:uri="http://schemas.microsoft.com/sharepoint/v3/contenttype/forms"/>
+  </ds:schemaRefs>
+</ds:datastoreItem>
+</file>
+
+<file path=customXml/itemProps3.xml><?xml version="1.0" encoding="utf-8"?>
 <ds:datastoreItem xmlns:ds="http://schemas.openxmlformats.org/officeDocument/2006/customXml" ds:itemID="{CFC89428-384C-4719-B49A-D48E322A1B48}">
   <ds:schemaRefs>
     <ds:schemaRef ds:uri="http://schemas.microsoft.com/office/2006/metadata/contentType"/>
@@ -15284,22 +15302,6 @@
 </ds:datastoreItem>
 </file>
 
-<file path=customXml/itemProps2.xml><?xml version="1.0" encoding="utf-8"?>
-<ds:datastoreItem xmlns:ds="http://schemas.openxmlformats.org/officeDocument/2006/customXml" ds:itemID="{C2475F33-3476-4294-A854-866A38AE37AD}">
-  <ds:schemaRefs>
-    <ds:schemaRef ds:uri="http://schemas.microsoft.com/sharepoint/v3/contenttype/forms"/>
-  </ds:schemaRefs>
-</ds:datastoreItem>
-</file>
-
-<file path=customXml/itemProps3.xml><?xml version="1.0" encoding="utf-8"?>
-<ds:datastoreItem xmlns:ds="http://schemas.openxmlformats.org/officeDocument/2006/customXml" ds:itemID="{89723AB6-AEB7-4B91-A3E6-C82E45933B72}">
-  <ds:schemaRefs>
-    <ds:schemaRef ds:uri="http://schemas.openxmlformats.org/officeDocument/2006/bibliography"/>
-  </ds:schemaRefs>
-</ds:datastoreItem>
-</file>
-
 <file path=customXml/itemProps4.xml><?xml version="1.0" encoding="utf-8"?>
 <ds:datastoreItem xmlns:ds="http://schemas.openxmlformats.org/officeDocument/2006/customXml" ds:itemID="{95175FBF-2AD9-4D0E-A227-0C8EA5FDBDE0}">
   <ds:schemaRefs>

</xml_diff>